<commit_message>
Gemini 3.8 Flash vòng 2: CSS safety-tech + ảnh chụp
Co-Authored-By: Claude <noreply@anthropic.com>
</commit_message>
<xml_diff>
--- a/docs/Ex1-20261022M-NguyenDucTruongPhuc.docx
+++ b/docs/Ex1-20261022M-NguyenDucTruongPhuc.docx
@@ -530,7 +530,7 @@
           <w:sz w:val="34"/>
           <w:szCs w:val="34"/>
         </w:rPr>
-        <w:t xml:space="preserve">Exercise 1 — Tên miền miễn phí &amp; Git/GitHub</w:t>
+        <w:t xml:space="preserve">Exercise 1 — Git &amp; GitHub</w:t>
       </w:r>
     </w:p>
     <w:p>
@@ -565,7 +565,7 @@
           <w:sz w:val="22"/>
           <w:szCs w:val="22"/>
         </w:rPr>
-        <w:t xml:space="preserve">Đăng ký một tên miền miễn phí (chương trình tên miền .id.vn của P.A Việt Nam hoặc Mắt Bão).</w:t>
+        <w:t xml:space="preserve">Tìm hiểu Git và GitHub qua tài liệu của CodeLearn và GitHub Docs.</w:t>
       </w:r>
     </w:p>
     <w:p>
@@ -583,7 +583,7 @@
           <w:sz w:val="22"/>
           <w:szCs w:val="22"/>
         </w:rPr>
-        <w:t xml:space="preserve">Tìm hiểu Git và GitHub qua tài liệu của CodeLearn và GitHub Docs.</w:t>
+        <w:t xml:space="preserve">Áp dụng vào việc quản lý mã nguồn của các bài tập trong môn học.</w:t>
       </w:r>
     </w:p>
     <w:p>
@@ -617,473 +617,7 @@
           <w:sz w:val="23"/>
           <w:szCs w:val="23"/>
         </w:rPr>
-        <w:t xml:space="preserve">2.1. Phần A — Đăng ký tên miền</w:t>
-      </w:r>
-    </w:p>
-    <w:p>
-      <w:pPr>
-        <w:spacing w:after="120" w:before="0"/>
-      </w:pPr>
-      <w:r>
-        <w:rPr>
-          <w:rFonts w:ascii="Calibri" w:cs="Calibri" w:eastAsia="Calibri" w:hAnsi="Calibri"/>
-          <w:sz w:val="22"/>
-          <w:szCs w:val="22"/>
-        </w:rPr>
-        <w:t xml:space="preserve">Chương trình tên miền .id.vn miễn phí là của Trung tâm Internet Việt Nam (VNNIC), dành cho người dùng cá nhân — đặc biệt là sinh viên. Miễn phí năm đầu, sau đó gia hạn có phí. Hai nhà đăng ký được đề bài gợi ý là P.A Việt Nam và Mắt Bão.</w:t>
-      </w:r>
-    </w:p>
-    <w:p>
-      <w:pPr>
-        <w:spacing w:after="120" w:before="0"/>
-      </w:pPr>
-      <w:r>
-        <w:rPr>
-          <w:rFonts w:ascii="Calibri" w:cs="Calibri" w:eastAsia="Calibri" w:hAnsi="Calibri"/>
-          <w:b/>
-          <w:bCs/>
-          <w:sz w:val="22"/>
-          <w:szCs w:val="22"/>
-        </w:rPr>
-        <w:t xml:space="preserve">Các bước thực hiện:</w:t>
-      </w:r>
-    </w:p>
-    <w:p>
-      <w:pPr>
-        <w:pStyle w:val="ListParagraph"/>
-        <w:numPr>
-          <w:ilvl w:val="0"/>
-          <w:numId w:val="2"/>
-        </w:numPr>
-        <w:spacing w:after="80"/>
-      </w:pPr>
-      <w:r>
-        <w:rPr>
-          <w:rFonts w:ascii="Calibri" w:cs="Calibri" w:eastAsia="Calibri" w:hAnsi="Calibri"/>
-          <w:sz w:val="22"/>
-          <w:szCs w:val="22"/>
-        </w:rPr>
-        <w:t xml:space="preserve">Chọn tên miền và kiểm tra còn trống trên công cụ tra cứu của nhà đăng ký. Nên đặt theo tên thật để dùng lâu dài, ví dụ truongphuc.id.vn.</w:t>
-      </w:r>
-    </w:p>
-    <w:p>
-      <w:pPr>
-        <w:pStyle w:val="ListParagraph"/>
-        <w:numPr>
-          <w:ilvl w:val="0"/>
-          <w:numId w:val="2"/>
-        </w:numPr>
-        <w:spacing w:after="80"/>
-      </w:pPr>
-      <w:r>
-        <w:rPr>
-          <w:rFonts w:ascii="Calibri" w:cs="Calibri" w:eastAsia="Calibri" w:hAnsi="Calibri"/>
-          <w:sz w:val="22"/>
-          <w:szCs w:val="22"/>
-        </w:rPr>
-        <w:t xml:space="preserve">Tạo tài khoản trên trang nhà đăng ký bằng email thật.</w:t>
-      </w:r>
-    </w:p>
-    <w:p>
-      <w:pPr>
-        <w:pStyle w:val="ListParagraph"/>
-        <w:numPr>
-          <w:ilvl w:val="0"/>
-          <w:numId w:val="2"/>
-        </w:numPr>
-        <w:spacing w:after="80"/>
-      </w:pPr>
-      <w:r>
-        <w:rPr>
-          <w:rFonts w:ascii="Calibri" w:cs="Calibri" w:eastAsia="Calibri" w:hAnsi="Calibri"/>
-          <w:sz w:val="22"/>
-          <w:szCs w:val="22"/>
-        </w:rPr>
-        <w:t xml:space="preserve">Khai thông tin chủ thể: tên miền .id.vn yêu cầu thông tin định danh cá nhân. Khai sai thì tên miền có thể bị thu hồi.</w:t>
-      </w:r>
-    </w:p>
-    <w:p>
-      <w:pPr>
-        <w:pStyle w:val="ListParagraph"/>
-        <w:numPr>
-          <w:ilvl w:val="0"/>
-          <w:numId w:val="2"/>
-        </w:numPr>
-        <w:spacing w:after="80"/>
-      </w:pPr>
-      <w:r>
-        <w:rPr>
-          <w:rFonts w:ascii="Calibri" w:cs="Calibri" w:eastAsia="Calibri" w:hAnsi="Calibri"/>
-          <w:sz w:val="22"/>
-          <w:szCs w:val="22"/>
-        </w:rPr>
-        <w:t xml:space="preserve">Xác thực qua email hoặc số điện thoại, sau đó chờ duyệt (thường trong 24 giờ).</w:t>
-      </w:r>
-    </w:p>
-    <w:p>
-      <w:pPr>
-        <w:pStyle w:val="ListParagraph"/>
-        <w:numPr>
-          <w:ilvl w:val="0"/>
-          <w:numId w:val="2"/>
-        </w:numPr>
-        <w:spacing w:after="80"/>
-      </w:pPr>
-      <w:r>
-        <w:rPr>
-          <w:rFonts w:ascii="Calibri" w:cs="Calibri" w:eastAsia="Calibri" w:hAnsi="Calibri"/>
-          <w:sz w:val="22"/>
-          <w:szCs w:val="22"/>
-        </w:rPr>
-        <w:t xml:space="preserve">Trỏ tên miền về GitHub Pages của repo bài tập (hướng dẫn ở mục 2.3).</w:t>
-      </w:r>
-    </w:p>
-    <w:p>
-      <w:pPr>
-        <w:spacing w:after="140"/>
-      </w:pPr>
-    </w:p>
-    <w:p>
-      <w:pPr>
-        <w:spacing w:after="120" w:before="0"/>
-      </w:pPr>
-      <w:r>
-        <w:rPr>
-          <w:rFonts w:ascii="Calibri" w:cs="Calibri" w:eastAsia="Calibri" w:hAnsi="Calibri"/>
-          <w:b/>
-          <w:bCs/>
-          <w:sz w:val="22"/>
-          <w:szCs w:val="22"/>
-        </w:rPr>
-        <w:t xml:space="preserve">Thông tin tên miền:</w:t>
-      </w:r>
-    </w:p>
-    <w:tbl>
-      <w:tblPr>
-        <w:tblW w:type="dxa" w:w="9026"/>
-        <w:tblBorders>
-          <w:top w:val="single" w:color="D9E0EA" w:sz="4"/>
-          <w:left w:val="single" w:color="D9E0EA" w:sz="4"/>
-          <w:bottom w:val="single" w:color="D9E0EA" w:sz="4"/>
-          <w:right w:val="single" w:color="D9E0EA" w:sz="4"/>
-          <w:insideH w:val="single" w:color="D9E0EA" w:sz="4"/>
-          <w:insideV w:val="single" w:color="D9E0EA" w:sz="4"/>
-        </w:tblBorders>
-      </w:tblPr>
-      <w:tblGrid>
-        <w:gridCol w:w="3249"/>
-        <w:gridCol w:w="5777"/>
-      </w:tblGrid>
-      <w:tr>
-        <w:trPr>
-          <w:tblHeader/>
-        </w:trPr>
-        <w:tc>
-          <w:tcPr>
-            <w:tcW w:type="dxa" w:w="3249"/>
-            <w:shd w:fill="EEF2F8" w:val="clear"/>
-            <w:tcMar>
-              <w:top w:type="dxa" w:w="80"/>
-              <w:left w:type="dxa" w:w="110"/>
-              <w:bottom w:type="dxa" w:w="80"/>
-              <w:right w:type="dxa" w:w="110"/>
-            </w:tcMar>
-          </w:tcPr>
-          <w:p>
-            <w:pPr>
-              <w:spacing w:after="0"/>
-            </w:pPr>
-            <w:r>
-              <w:rPr>
-                <w:rFonts w:ascii="Calibri" w:cs="Calibri" w:eastAsia="Calibri" w:hAnsi="Calibri"/>
-                <w:b/>
-                <w:bCs/>
-                <w:color w:val="10305B"/>
-                <w:sz w:val="20"/>
-                <w:szCs w:val="20"/>
-              </w:rPr>
-              <w:t xml:space="preserve">Mục</w:t>
-            </w:r>
-          </w:p>
-        </w:tc>
-        <w:tc>
-          <w:tcPr>
-            <w:tcW w:type="dxa" w:w="5777"/>
-            <w:shd w:fill="EEF2F8" w:val="clear"/>
-            <w:tcMar>
-              <w:top w:type="dxa" w:w="80"/>
-              <w:left w:type="dxa" w:w="110"/>
-              <w:bottom w:type="dxa" w:w="80"/>
-              <w:right w:type="dxa" w:w="110"/>
-            </w:tcMar>
-          </w:tcPr>
-          <w:p>
-            <w:pPr>
-              <w:spacing w:after="0"/>
-            </w:pPr>
-            <w:r>
-              <w:rPr>
-                <w:rFonts w:ascii="Calibri" w:cs="Calibri" w:eastAsia="Calibri" w:hAnsi="Calibri"/>
-                <w:b/>
-                <w:bCs/>
-                <w:color w:val="10305B"/>
-                <w:sz w:val="20"/>
-                <w:szCs w:val="20"/>
-              </w:rPr>
-              <w:t xml:space="preserve">Nội dung</w:t>
-            </w:r>
-          </w:p>
-        </w:tc>
-      </w:tr>
-      <w:tr>
-        <w:trPr>
-          <w:tblHeader w:val="false"/>
-        </w:trPr>
-        <w:tc>
-          <w:tcPr>
-            <w:tcW w:type="dxa" w:w="3249"/>
-            <w:tcMar>
-              <w:top w:type="dxa" w:w="80"/>
-              <w:left w:type="dxa" w:w="110"/>
-              <w:bottom w:type="dxa" w:w="80"/>
-              <w:right w:type="dxa" w:w="110"/>
-            </w:tcMar>
-          </w:tcPr>
-          <w:p>
-            <w:pPr>
-              <w:spacing w:after="0"/>
-            </w:pPr>
-            <w:r>
-              <w:rPr>
-                <w:rFonts w:ascii="Calibri" w:cs="Calibri" w:eastAsia="Calibri" w:hAnsi="Calibri"/>
-                <w:b w:val="false"/>
-                <w:bCs w:val="false"/>
-                <w:sz w:val="20"/>
-                <w:szCs w:val="20"/>
-              </w:rPr>
-              <w:t xml:space="preserve">Tên miền</w:t>
-            </w:r>
-          </w:p>
-        </w:tc>
-        <w:tc>
-          <w:tcPr>
-            <w:tcW w:type="dxa" w:w="5777"/>
-            <w:tcMar>
-              <w:top w:type="dxa" w:w="80"/>
-              <w:left w:type="dxa" w:w="110"/>
-              <w:bottom w:type="dxa" w:w="80"/>
-              <w:right w:type="dxa" w:w="110"/>
-            </w:tcMar>
-          </w:tcPr>
-          <w:p>
-            <w:pPr>
-              <w:spacing w:after="0"/>
-            </w:pPr>
-            <w:r>
-              <w:rPr>
-                <w:rFonts w:ascii="Calibri" w:cs="Calibri" w:eastAsia="Calibri" w:hAnsi="Calibri"/>
-                <w:b w:val="false"/>
-                <w:bCs w:val="false"/>
-                <w:sz w:val="20"/>
-                <w:szCs w:val="20"/>
-              </w:rPr>
-              <w:t xml:space="preserve">____________.id.vn</w:t>
-            </w:r>
-          </w:p>
-        </w:tc>
-      </w:tr>
-      <w:tr>
-        <w:trPr>
-          <w:tblHeader w:val="false"/>
-        </w:trPr>
-        <w:tc>
-          <w:tcPr>
-            <w:tcW w:type="dxa" w:w="3249"/>
-            <w:tcMar>
-              <w:top w:type="dxa" w:w="80"/>
-              <w:left w:type="dxa" w:w="110"/>
-              <w:bottom w:type="dxa" w:w="80"/>
-              <w:right w:type="dxa" w:w="110"/>
-            </w:tcMar>
-          </w:tcPr>
-          <w:p>
-            <w:pPr>
-              <w:spacing w:after="0"/>
-            </w:pPr>
-            <w:r>
-              <w:rPr>
-                <w:rFonts w:ascii="Calibri" w:cs="Calibri" w:eastAsia="Calibri" w:hAnsi="Calibri"/>
-                <w:b w:val="false"/>
-                <w:bCs w:val="false"/>
-                <w:sz w:val="20"/>
-                <w:szCs w:val="20"/>
-              </w:rPr>
-              <w:t xml:space="preserve">Nhà đăng ký</w:t>
-            </w:r>
-          </w:p>
-        </w:tc>
-        <w:tc>
-          <w:tcPr>
-            <w:tcW w:type="dxa" w:w="5777"/>
-            <w:tcMar>
-              <w:top w:type="dxa" w:w="80"/>
-              <w:left w:type="dxa" w:w="110"/>
-              <w:bottom w:type="dxa" w:w="80"/>
-              <w:right w:type="dxa" w:w="110"/>
-            </w:tcMar>
-          </w:tcPr>
-          <w:p>
-            <w:pPr>
-              <w:spacing w:after="0"/>
-            </w:pPr>
-            <w:r>
-              <w:rPr>
-                <w:rFonts w:ascii="Calibri" w:cs="Calibri" w:eastAsia="Calibri" w:hAnsi="Calibri"/>
-                <w:b w:val="false"/>
-                <w:bCs w:val="false"/>
-                <w:sz w:val="20"/>
-                <w:szCs w:val="20"/>
-              </w:rPr>
-              <w:t xml:space="preserve">☐ P.A Việt Nam      ☐ Mắt Bão</w:t>
-            </w:r>
-          </w:p>
-        </w:tc>
-      </w:tr>
-      <w:tr>
-        <w:trPr>
-          <w:tblHeader w:val="false"/>
-        </w:trPr>
-        <w:tc>
-          <w:tcPr>
-            <w:tcW w:type="dxa" w:w="3249"/>
-            <w:tcMar>
-              <w:top w:type="dxa" w:w="80"/>
-              <w:left w:type="dxa" w:w="110"/>
-              <w:bottom w:type="dxa" w:w="80"/>
-              <w:right w:type="dxa" w:w="110"/>
-            </w:tcMar>
-          </w:tcPr>
-          <w:p>
-            <w:pPr>
-              <w:spacing w:after="0"/>
-            </w:pPr>
-            <w:r>
-              <w:rPr>
-                <w:rFonts w:ascii="Calibri" w:cs="Calibri" w:eastAsia="Calibri" w:hAnsi="Calibri"/>
-                <w:b w:val="false"/>
-                <w:bCs w:val="false"/>
-                <w:sz w:val="20"/>
-                <w:szCs w:val="20"/>
-              </w:rPr>
-              <w:t xml:space="preserve">Ngày đăng ký</w:t>
-            </w:r>
-          </w:p>
-        </w:tc>
-        <w:tc>
-          <w:tcPr>
-            <w:tcW w:type="dxa" w:w="5777"/>
-            <w:tcMar>
-              <w:top w:type="dxa" w:w="80"/>
-              <w:left w:type="dxa" w:w="110"/>
-              <w:bottom w:type="dxa" w:w="80"/>
-              <w:right w:type="dxa" w:w="110"/>
-            </w:tcMar>
-          </w:tcPr>
-          <w:p>
-            <w:pPr>
-              <w:spacing w:after="0"/>
-            </w:pPr>
-            <w:r>
-              <w:rPr>
-                <w:rFonts w:ascii="Calibri" w:cs="Calibri" w:eastAsia="Calibri" w:hAnsi="Calibri"/>
-                <w:b w:val="false"/>
-                <w:bCs w:val="false"/>
-                <w:sz w:val="20"/>
-                <w:szCs w:val="20"/>
-              </w:rPr>
-              <w:t xml:space="preserve"/>
-            </w:r>
-          </w:p>
-        </w:tc>
-      </w:tr>
-      <w:tr>
-        <w:trPr>
-          <w:tblHeader w:val="false"/>
-        </w:trPr>
-        <w:tc>
-          <w:tcPr>
-            <w:tcW w:type="dxa" w:w="3249"/>
-            <w:tcMar>
-              <w:top w:type="dxa" w:w="80"/>
-              <w:left w:type="dxa" w:w="110"/>
-              <w:bottom w:type="dxa" w:w="80"/>
-              <w:right w:type="dxa" w:w="110"/>
-            </w:tcMar>
-          </w:tcPr>
-          <w:p>
-            <w:pPr>
-              <w:spacing w:after="0"/>
-            </w:pPr>
-            <w:r>
-              <w:rPr>
-                <w:rFonts w:ascii="Calibri" w:cs="Calibri" w:eastAsia="Calibri" w:hAnsi="Calibri"/>
-                <w:b w:val="false"/>
-                <w:bCs w:val="false"/>
-                <w:sz w:val="20"/>
-                <w:szCs w:val="20"/>
-              </w:rPr>
-              <w:t xml:space="preserve">Ngày hết hạn</w:t>
-            </w:r>
-          </w:p>
-        </w:tc>
-        <w:tc>
-          <w:tcPr>
-            <w:tcW w:type="dxa" w:w="5777"/>
-            <w:tcMar>
-              <w:top w:type="dxa" w:w="80"/>
-              <w:left w:type="dxa" w:w="110"/>
-              <w:bottom w:type="dxa" w:w="80"/>
-              <w:right w:type="dxa" w:w="110"/>
-            </w:tcMar>
-          </w:tcPr>
-          <w:p>
-            <w:pPr>
-              <w:spacing w:after="0"/>
-            </w:pPr>
-            <w:r>
-              <w:rPr>
-                <w:rFonts w:ascii="Calibri" w:cs="Calibri" w:eastAsia="Calibri" w:hAnsi="Calibri"/>
-                <w:b w:val="false"/>
-                <w:bCs w:val="false"/>
-                <w:sz w:val="20"/>
-                <w:szCs w:val="20"/>
-              </w:rPr>
-              <w:t xml:space="preserve"/>
-            </w:r>
-          </w:p>
-        </w:tc>
-      </w:tr>
-    </w:tbl>
-    <w:p>
-      <w:r>
-        <w:br w:type="page"/>
-      </w:r>
-    </w:p>
-    <w:p>
-      <w:pPr>
-        <w:pStyle w:val="Heading3"/>
-        <w:spacing w:after="110" w:before="220"/>
-      </w:pPr>
-      <w:r>
-        <w:rPr>
-          <w:rFonts w:ascii="Calibri" w:cs="Calibri" w:eastAsia="Calibri" w:hAnsi="Calibri"/>
-          <w:b/>
-          <w:bCs/>
-          <w:color w:val="0F766E"/>
-          <w:sz w:val="23"/>
-          <w:szCs w:val="23"/>
-        </w:rPr>
-        <w:t xml:space="preserve">2.2. Phần B — Git &amp; GitHub</w:t>
+        <w:t xml:space="preserve">2.1. Tài liệu đã đọc</w:t>
       </w:r>
     </w:p>
     <w:p>
@@ -2316,7 +1850,20 @@
           <w:sz w:val="23"/>
           <w:szCs w:val="23"/>
         </w:rPr>
-        <w:t xml:space="preserve">2.3. Ghép hai phần: đưa trang lên tên miền vừa đăng ký</w:t>
+        <w:t xml:space="preserve">2.2. Đưa trang lên GitHub Pages</w:t>
+      </w:r>
+    </w:p>
+    <w:p>
+      <w:pPr>
+        <w:spacing w:after="120" w:before="0"/>
+      </w:pPr>
+      <w:r>
+        <w:rPr>
+          <w:rFonts w:ascii="Calibri" w:cs="Calibri" w:eastAsia="Calibri" w:hAnsi="Calibri"/>
+          <w:sz w:val="22"/>
+          <w:szCs w:val="22"/>
+        </w:rPr>
+        <w:t xml:space="preserve">Repo bài tập chỉ gồm HTML/CSS/JS tĩnh nên có thể cho chạy thật bằng GitHub Pages mà không cần máy chủ riêng:</w:t>
       </w:r>
     </w:p>
     <w:p>
@@ -2352,7 +1899,7 @@
           <w:sz w:val="22"/>
           <w:szCs w:val="22"/>
         </w:rPr>
-        <w:t xml:space="preserve">Vào Settings → Pages → Custom domain, nhập tên miền .id.vn đã đăng ký.</w:t>
+        <w:t xml:space="preserve">GitHub cấp địa chỉ dạng https://chuanbico.github.io/CN-Web/ sau vài phút.</w:t>
       </w:r>
     </w:p>
     <w:p>
@@ -2370,25 +1917,7 @@
           <w:sz w:val="22"/>
           <w:szCs w:val="22"/>
         </w:rPr>
-        <w:t xml:space="preserve">Về trang quản lý DNS của nhà đăng ký, thêm bản ghi CNAME cho www trỏ về chuanbico.github.io, và 4 bản ghi A cho @ trỏ về 185.199.108.153, 185.199.109.153, 185.199.110.153, 185.199.111.153.</w:t>
-      </w:r>
-    </w:p>
-    <w:p>
-      <w:pPr>
-        <w:pStyle w:val="ListParagraph"/>
-        <w:numPr>
-          <w:ilvl w:val="0"/>
-          <w:numId w:val="2"/>
-        </w:numPr>
-        <w:spacing w:after="80"/>
-      </w:pPr>
-      <w:r>
-        <w:rPr>
-          <w:rFonts w:ascii="Calibri" w:cs="Calibri" w:eastAsia="Calibri" w:hAnsi="Calibri"/>
-          <w:sz w:val="22"/>
-          <w:szCs w:val="22"/>
-        </w:rPr>
-        <w:t xml:space="preserve">Chờ DNS cập nhật rồi bật Enforce HTTPS.</w:t>
+        <w:t xml:space="preserve">Bật Enforce HTTPS để trang chạy qua kết nối mã hoá.</w:t>
       </w:r>
     </w:p>
     <w:p>

</xml_diff>